<commit_message>
docs: PROJECT_INFO + DEV_LOG 업데이트, docx 재변환
CCG 점검 및 UI 개선 내용 반영

Confidence: high
Scope-risk: narrow
</commit_message>
<xml_diff>
--- a/docs/exports/DEV_LOG.docx
+++ b/docs/exports/DEV_LOG.docx
@@ -2,7 +2,7 @@
 <file path=word/document.xml><?xml version="1.0" encoding="utf-8"?>
 <w:document xmlns:w="http://schemas.openxmlformats.org/wordprocessingml/2006/main" xmlns:m="http://schemas.openxmlformats.org/officeDocument/2006/math" xmlns:r="http://schemas.openxmlformats.org/officeDocument/2006/relationships" xmlns:o="urn:schemas-microsoft-com:office:office" xmlns:v="urn:schemas-microsoft-com:vml" xmlns:w10="urn:schemas-microsoft-com:office:word" xmlns:a="http://schemas.openxmlformats.org/drawingml/2006/main" xmlns:pic="http://schemas.openxmlformats.org/drawingml/2006/picture" xmlns:wp="http://schemas.openxmlformats.org/drawingml/2006/wordprocessingDrawing">
   <w:body>
-    <w:bookmarkStart w:id="21" w:name="dev_log-hvd-landing"/>
+    <w:bookmarkStart w:id="22" w:name="dev_log-hvd-landing"/>
     <w:p>
       <w:pPr>
         <w:pStyle w:val="Heading1"/>
@@ -18,13 +18,13 @@
         </w:pict>
       </w:r>
     </w:p>
-    <w:bookmarkStart w:id="20" w:name="오늘-프로젝트-초기-구현-완료"/>
+    <w:bookmarkStart w:id="20" w:name="ccg-점검-ui-전면-개선"/>
     <w:p>
       <w:pPr>
         <w:pStyle w:val="Heading3"/>
       </w:pPr>
       <w:r>
-        <w:t xml:space="preserve">[2026-06-02 오늘] 프로젝트 초기 구현 완료</w:t>
+        <w:t xml:space="preserve">[2026-06-02 22:50] CCG 점검 + UI 전면 개선</w:t>
       </w:r>
     </w:p>
     <w:p>
@@ -50,7 +50,7 @@
         <w:pStyle w:val="BodyText"/>
       </w:pPr>
       <w:r>
-        <w:t xml:space="preserve">하버드 디베이트 워크샵 랜딩페이지를 처음 만들었습니다.</w:t>
+        <w:t xml:space="preserve">시각 품질과 코드 안정성을 대폭 개선했습니다.</w:t>
       </w:r>
     </w:p>
     <w:p>
@@ -62,7 +62,7 @@
         <w:pStyle w:val="Compact"/>
       </w:pPr>
       <w:r>
-        <w:t xml:space="preserve">Next.js 16 + Tailwind CSS 4로 프로젝트를 세팅했습니다</w:t>
+        <w:t xml:space="preserve">카드 테두리를 매우 진한 warm dark(#7c776f)로 변경해 어떤 배경에서도 명확히 보이게 했습니다</w:t>
       </w:r>
     </w:p>
     <w:p>
@@ -74,7 +74,7 @@
         <w:pStyle w:val="Compact"/>
       </w:pPr>
       <w:r>
-        <w:t xml:space="preserve">핸드오프 패키지(CLAUDE.md, docs/, assets/)를 전부 검토하고 구현 계획서(IMPLEMENTATION_PLAN.md)를 먼저 작성했습니다</w:t>
+        <w:t xml:space="preserve">밝은 섹션(WhyNow, Admissions, FAQ)에 크림 계열 배경(#e4dfd3)을 적용해 섹션 구분을 명확히 했습니다</w:t>
       </w:r>
     </w:p>
     <w:p>
@@ -86,7 +86,7 @@
         <w:pStyle w:val="Compact"/>
       </w:pPr>
       <w:r>
-        <w:t xml:space="preserve">랜딩 페이지(/) 11개 섹션, 신청 완료 페이지(/thanks)를 구현했습니다</w:t>
+        <w:t xml:space="preserve">6개 카드 상단에 Unsplash 무료 이미지를 각 주제에 맞게 삽입했습니다 (책/대학/지구/노트/도서관/마이크)</w:t>
       </w:r>
     </w:p>
     <w:p>
@@ -98,7 +98,7 @@
         <w:pStyle w:val="Compact"/>
       </w:pPr>
       <w:r>
-        <w:t xml:space="preserve">사전 상담 신청 폼(LeadForm)을 구현했습니다 — Apps Script URL이 없으면 데모 모드(콘솔 로그)로 동작합니다</w:t>
+        <w:t xml:space="preserve">Unsplash 도메인을 next.config.ts remotePatterns에 추가했습니다</w:t>
       </w:r>
     </w:p>
     <w:p>
@@ -110,7 +110,7 @@
         <w:pStyle w:val="Compact"/>
       </w:pPr>
       <w:r>
-        <w:t xml:space="preserve">모바일 하단 고정 CTA, iOS 인앱 브라우저 대응(100dvh/safe-area)을 적용했습니다</w:t>
+        <w:t xml:space="preserve">Thanks 페이지 배경을 bg-white로 변경했습니다</w:t>
       </w:r>
     </w:p>
     <w:p>
@@ -122,7 +122,22 @@
         <w:pStyle w:val="Compact"/>
       </w:pPr>
       <w:r>
-        <w:t xml:space="preserve">가격($4,500 등) 노출 0건, 금지어 0건 확인 완료</w:t>
+        <w:t xml:space="preserve">CCG(Codex+Gemini+Claude) 3모델 점검 결과: noValidate 제거, res.ok 검사 추가, 터치 타겟 44px 확보, role=</w:t>
+      </w:r>
+      <w:r>
+        <w:t xml:space="preserve">“</w:t>
+      </w:r>
+      <w:r>
+        <w:t xml:space="preserve">alert</w:t>
+      </w:r>
+      <w:r>
+        <w:t xml:space="preserve">”</w:t>
+      </w:r>
+      <w:r>
+        <w:t xml:space="preserve"> </w:t>
+      </w:r>
+      <w:r>
+        <w:t xml:space="preserve">접근성 추가, Link 컴포넌트 전환</w:t>
       </w:r>
     </w:p>
     <w:p>
@@ -134,31 +149,19 @@
         <w:pStyle w:val="Compact"/>
       </w:pPr>
       <w:r>
-        <w:rPr>
-          <w:rStyle w:val="VerbatimChar"/>
-        </w:rPr>
-        <w:t xml:space="preserve">npm run build</w:t>
-      </w:r>
-      <w:r>
-        <w:t xml:space="preserve"> </w:t>
-      </w:r>
-      <w:r>
-        <w:t xml:space="preserve">+</w:t>
-      </w:r>
-      <w:r>
-        <w:t xml:space="preserve"> </w:t>
-      </w:r>
-      <w:r>
-        <w:rPr>
-          <w:rStyle w:val="VerbatimChar"/>
-        </w:rPr>
-        <w:t xml:space="preserve">typecheck</w:t>
-      </w:r>
-      <w:r>
-        <w:t xml:space="preserve"> </w:t>
-      </w:r>
-      <w:r>
-        <w:t xml:space="preserve">경고 0건으로 통과</w:t>
+        <w:t xml:space="preserve">파비콘(32px)/애플 터치 아이콘(180px), OG 메타태그, keywords, canonical URL 추가</w:t>
+      </w:r>
+    </w:p>
+    <w:p>
+      <w:pPr>
+        <w:numPr>
+          <w:ilvl w:val="0"/>
+          <w:numId w:val="1001"/>
+        </w:numPr>
+        <w:pStyle w:val="Compact"/>
+      </w:pPr>
+      <w:r>
+        <w:t xml:space="preserve">파트너 로고(ASDA KOREA · YBM EDU)를 Footer와 HarvardDiff 섹션에서 크게 표시</w:t>
       </w:r>
     </w:p>
     <w:p>
@@ -221,8 +224,219 @@
         <w:t xml:space="preserve">페이지 구현</w:t>
       </w:r>
     </w:p>
+    <w:p>
+      <w:r>
+        <w:pict>
+          <v:rect style="width:0;height:1.5pt" o:hralign="center" o:hrstd="t" o:hr="t"/>
+        </w:pict>
+      </w:r>
+    </w:p>
     <w:bookmarkEnd w:id="20"/>
+    <w:bookmarkStart w:id="21" w:name="프로젝트-초기-구현-완료"/>
+    <w:p>
+      <w:pPr>
+        <w:pStyle w:val="Heading3"/>
+      </w:pPr>
+      <w:r>
+        <w:t xml:space="preserve">[2026-06-02 17:50] 프로젝트 초기 구현 완료</w:t>
+      </w:r>
+    </w:p>
+    <w:p>
+      <w:pPr>
+        <w:pStyle w:val="FirstParagraph"/>
+      </w:pPr>
+      <w:r>
+        <w:rPr>
+          <w:bCs/>
+          <w:b/>
+        </w:rPr>
+        <w:t xml:space="preserve">상태:</w:t>
+      </w:r>
+      <w:r>
+        <w:t xml:space="preserve"> </w:t>
+      </w:r>
+      <w:r>
+        <w:t xml:space="preserve">완료</w:t>
+      </w:r>
+    </w:p>
+    <w:p>
+      <w:pPr>
+        <w:pStyle w:val="BodyText"/>
+      </w:pPr>
+      <w:r>
+        <w:t xml:space="preserve">하버드 디베이트 워크샵 랜딩페이지를 처음 만들었습니다.</w:t>
+      </w:r>
+    </w:p>
+    <w:p>
+      <w:pPr>
+        <w:numPr>
+          <w:ilvl w:val="0"/>
+          <w:numId w:val="1002"/>
+        </w:numPr>
+        <w:pStyle w:val="Compact"/>
+      </w:pPr>
+      <w:r>
+        <w:t xml:space="preserve">Next.js 16 + Tailwind CSS 4로 프로젝트를 세팅했습니다</w:t>
+      </w:r>
+    </w:p>
+    <w:p>
+      <w:pPr>
+        <w:numPr>
+          <w:ilvl w:val="0"/>
+          <w:numId w:val="1002"/>
+        </w:numPr>
+        <w:pStyle w:val="Compact"/>
+      </w:pPr>
+      <w:r>
+        <w:t xml:space="preserve">핸드오프 패키지(CLAUDE.md, docs/, assets/)를 전부 검토하고 구현 계획서(IMPLEMENTATION_PLAN.md)를 먼저 작성했습니다</w:t>
+      </w:r>
+    </w:p>
+    <w:p>
+      <w:pPr>
+        <w:numPr>
+          <w:ilvl w:val="0"/>
+          <w:numId w:val="1002"/>
+        </w:numPr>
+        <w:pStyle w:val="Compact"/>
+      </w:pPr>
+      <w:r>
+        <w:t xml:space="preserve">랜딩 페이지(/) 11개 섹션, 신청 완료 페이지(/thanks)를 구현했습니다</w:t>
+      </w:r>
+    </w:p>
+    <w:p>
+      <w:pPr>
+        <w:numPr>
+          <w:ilvl w:val="0"/>
+          <w:numId w:val="1002"/>
+        </w:numPr>
+        <w:pStyle w:val="Compact"/>
+      </w:pPr>
+      <w:r>
+        <w:t xml:space="preserve">사전 상담 신청 폼(LeadForm)을 구현했습니다 — Apps Script URL이 없으면 데모 모드(콘솔 로그)로 동작합니다</w:t>
+      </w:r>
+    </w:p>
+    <w:p>
+      <w:pPr>
+        <w:numPr>
+          <w:ilvl w:val="0"/>
+          <w:numId w:val="1002"/>
+        </w:numPr>
+        <w:pStyle w:val="Compact"/>
+      </w:pPr>
+      <w:r>
+        <w:t xml:space="preserve">모바일 하단 고정 CTA, iOS 인앱 브라우저 대응(100dvh/safe-area)을 적용했습니다</w:t>
+      </w:r>
+    </w:p>
+    <w:p>
+      <w:pPr>
+        <w:numPr>
+          <w:ilvl w:val="0"/>
+          <w:numId w:val="1002"/>
+        </w:numPr>
+        <w:pStyle w:val="Compact"/>
+      </w:pPr>
+      <w:r>
+        <w:t xml:space="preserve">가격($4,500 등) 노출 0건, 금지어 0건 확인 완료</w:t>
+      </w:r>
+    </w:p>
+    <w:p>
+      <w:pPr>
+        <w:numPr>
+          <w:ilvl w:val="0"/>
+          <w:numId w:val="1002"/>
+        </w:numPr>
+        <w:pStyle w:val="Compact"/>
+      </w:pPr>
+      <w:r>
+        <w:rPr>
+          <w:rStyle w:val="VerbatimChar"/>
+        </w:rPr>
+        <w:t xml:space="preserve">npm run build</w:t>
+      </w:r>
+      <w:r>
+        <w:t xml:space="preserve"> </w:t>
+      </w:r>
+      <w:r>
+        <w:t xml:space="preserve">+</w:t>
+      </w:r>
+      <w:r>
+        <w:t xml:space="preserve"> </w:t>
+      </w:r>
+      <w:r>
+        <w:rPr>
+          <w:rStyle w:val="VerbatimChar"/>
+        </w:rPr>
+        <w:t xml:space="preserve">typecheck</w:t>
+      </w:r>
+      <w:r>
+        <w:t xml:space="preserve"> </w:t>
+      </w:r>
+      <w:r>
+        <w:t xml:space="preserve">경고 0건으로 통과</w:t>
+      </w:r>
+    </w:p>
+    <w:p>
+      <w:pPr>
+        <w:pStyle w:val="FirstParagraph"/>
+      </w:pPr>
+      <w:r>
+        <w:rPr>
+          <w:bCs/>
+          <w:b/>
+        </w:rPr>
+        <w:t xml:space="preserve">다음 작업:</w:t>
+      </w:r>
+      <w:r>
+        <w:t xml:space="preserve"> </w:t>
+      </w:r>
+      <w:r>
+        <w:t xml:space="preserve">- Apps Script 웹앱 URL 발급 후</w:t>
+      </w:r>
+      <w:r>
+        <w:t xml:space="preserve"> </w:t>
+      </w:r>
+      <w:r>
+        <w:rPr>
+          <w:rStyle w:val="VerbatimChar"/>
+        </w:rPr>
+        <w:t xml:space="preserve">NEXT_PUBLIC_FORM_ENDPOINT</w:t>
+      </w:r>
+      <w:r>
+        <w:t xml:space="preserve"> </w:t>
+      </w:r>
+      <w:r>
+        <w:t xml:space="preserve">환경변수 연결</w:t>
+      </w:r>
+      <w:r>
+        <w:t xml:space="preserve"> </w:t>
+      </w:r>
+      <w:r>
+        <w:t xml:space="preserve">- GA4 / Meta Pixel ID 연결</w:t>
+      </w:r>
+      <w:r>
+        <w:t xml:space="preserve"> </w:t>
+      </w:r>
+      <w:r>
+        <w:t xml:space="preserve">- 개인정보처리방침 내용 수령 후</w:t>
+      </w:r>
+      <w:r>
+        <w:t xml:space="preserve"> </w:t>
+      </w:r>
+      <w:r>
+        <w:rPr>
+          <w:rStyle w:val="VerbatimChar"/>
+        </w:rPr>
+        <w:t xml:space="preserve">/privacy</w:t>
+      </w:r>
+      <w:r>
+        <w:t xml:space="preserve"> </w:t>
+      </w:r>
+      <w:r>
+        <w:t xml:space="preserve">페이지 구현</w:t>
+      </w:r>
+    </w:p>
     <w:bookmarkEnd w:id="21"/>
+    <w:bookmarkEnd w:id="22"/>
     <w:sectPr/>
   </w:body>
 </w:document>
@@ -409,6 +623,9 @@
     <w:abstractNumId w:val="990"/>
   </w:num>
   <w:num w:numId="1001">
+    <w:abstractNumId w:val="991"/>
+  </w:num>
+  <w:num w:numId="1002">
     <w:abstractNumId w:val="991"/>
   </w:num>
 </w:numbering>

</xml_diff>